<commit_message>
Add voice-to-text dictation to key free-text fields
</commit_message>
<xml_diff>
--- a/public/CODA_How_To_Use.docx
+++ b/public/CODA_How_To_Use.docx
@@ -356,6 +356,23 @@
       </w:pPr>
       <w:r>
         <w:t xml:space="preserve">Add Key Outcomes Focus — this can pull straight from the coach's IDP (Individual Development Plan) if one is on file.</w:t>
+      </w:r>
+    </w:p>
+    <w:p>
+      <w:pPr>
+        <w:pBdr>
+          <w:left w:val="single" w:color="C9A227" w:sz="12" w:space="8"/>
+        </w:pBdr>
+        <w:spacing w:after="200" w:before="60"/>
+        <w:ind w:left="360"/>
+      </w:pPr>
+      <w:r>
+        <w:rPr>
+          <w:i/>
+          <w:iCs/>
+          <w:color w:val="64748B"/>
+        </w:rPr>
+        <w:t xml:space="preserve">Fields with a small mic icon in the corner (Session Objective, Key Outcomes Focus, Strengths, Areas for Development, Plan Notes, and General Notes) support voice dictation in supported browsers (Chrome, Edge, Safari) — select the mic and speak instead of typing.</w:t>
       </w:r>
     </w:p>
     <w:p>

</xml_diff>

<commit_message>
Filter History dropdowns to only coaches/CETs with observations; refresh how-to-use doc
</commit_message>
<xml_diff>
--- a/public/CODA_How_To_Use.docx
+++ b/public/CODA_How_To_Use.docx
@@ -71,39 +71,55 @@
         <w:spacing w:after="160"/>
       </w:pPr>
       <w:r>
-        <w:t xml:space="preserve">2. Logging a New Observation</w:t>
-      </w:r>
-    </w:p>
-    <w:p>
-      <w:pPr>
-        <w:spacing w:after="160"/>
-      </w:pPr>
-      <w:r>
-        <w:t xml:space="preserve">3. Completed Tasks</w:t>
-      </w:r>
-    </w:p>
-    <w:p>
-      <w:pPr>
-        <w:spacing w:after="160"/>
-      </w:pPr>
-      <w:r>
-        <w:t xml:space="preserve">4. Logistics</w:t>
-      </w:r>
-    </w:p>
-    <w:p>
-      <w:pPr>
-        <w:spacing w:after="160"/>
-      </w:pPr>
-      <w:r>
-        <w:t xml:space="preserve">5. History</w:t>
-      </w:r>
-    </w:p>
-    <w:p>
-      <w:pPr>
-        <w:spacing w:after="160"/>
-      </w:pPr>
-      <w:r>
-        <w:t xml:space="preserve">6. Tips &amp; Troubleshooting</w:t>
+        <w:t xml:space="preserve">2. The Landing Page</w:t>
+      </w:r>
+    </w:p>
+    <w:p>
+      <w:pPr>
+        <w:spacing w:after="160"/>
+      </w:pPr>
+      <w:r>
+        <w:t xml:space="preserve">3. Logging a New Observation</w:t>
+      </w:r>
+    </w:p>
+    <w:p>
+      <w:pPr>
+        <w:spacing w:after="160"/>
+      </w:pPr>
+      <w:r>
+        <w:t xml:space="preserve">4. Completed Tasks</w:t>
+      </w:r>
+    </w:p>
+    <w:p>
+      <w:pPr>
+        <w:spacing w:after="160"/>
+      </w:pPr>
+      <w:r>
+        <w:t xml:space="preserve">5. Logistics</w:t>
+      </w:r>
+    </w:p>
+    <w:p>
+      <w:pPr>
+        <w:spacing w:after="160"/>
+      </w:pPr>
+      <w:r>
+        <w:t xml:space="preserve">6. History</w:t>
+      </w:r>
+    </w:p>
+    <w:p>
+      <w:pPr>
+        <w:spacing w:after="160"/>
+      </w:pPr>
+      <w:r>
+        <w:t xml:space="preserve">7. Admin Settings — Master vs Federation Admin</w:t>
+      </w:r>
+    </w:p>
+    <w:p>
+      <w:pPr>
+        <w:spacing w:after="160"/>
+      </w:pPr>
+      <w:r>
+        <w:t xml:space="preserve">8. Tips &amp; Troubleshooting</w:t>
       </w:r>
     </w:p>
     <w:p>
@@ -125,24 +141,7 @@
         <w:spacing w:after="160"/>
       </w:pPr>
       <w:r>
-        <w:t xml:space="preserve">CODA is a shared workspace — every Coach Educator using the app sees the same coaches, courses, and observation history. There is no separate login per person; instead, each person is given a 4-digit PIN.</w:t>
-      </w:r>
-    </w:p>
-    <w:p>
-      <w:pPr>
-        <w:pStyle w:val="Heading2"/>
-        <w:spacing w:after="120" w:before="240"/>
-      </w:pPr>
-      <w:r>
-        <w:t xml:space="preserve">Signing in</w:t>
-      </w:r>
-    </w:p>
-    <w:p>
-      <w:pPr>
-        <w:spacing w:after="160"/>
-      </w:pPr>
-      <w:r>
-        <w:t xml:space="preserve">On opening CODA, enter your PIN and select Continue. Your name will show at the top of the screen for the rest of your session. If you don't have a PIN, ask your Admin to add you.</w:t>
+        <w:t xml:space="preserve">CODA is a shared workspace — everyone using it sees the same coaches, courses, and observation history. There's no password to get in; the first time you open CODA on a device, you're asked for your FA Number just to identify who you are. It's remembered on that device from then on — no need to re-enter it each visit.</w:t>
       </w:r>
     </w:p>
     <w:p>
@@ -159,7 +158,7 @@
           <w:iCs/>
           <w:color w:val="64748B"/>
         </w:rPr>
-        <w:t xml:space="preserve">If you close the app and come back later, you'll need to sign in again — CODA doesn't keep you signed in indefinitely.</w:t>
+        <w:t xml:space="preserve">This is identification, not security — it doesn't restrict what you can see or do. Admin-only actions (further down) have their own separate PIN.</w:t>
       </w:r>
     </w:p>
     <w:p>
@@ -233,7 +232,15 @@
         <w:spacing w:after="80"/>
       </w:pPr>
       <w:r>
-        <w:t xml:space="preserve">History — every submitted observation, with search, PDF export, and Admin Settings.</w:t>
+        <w:t xml:space="preserve">History — every submitted observation, with filters, PDF export, and Admin Settings.</w:t>
+      </w:r>
+    </w:p>
+    <w:p>
+      <w:pPr>
+        <w:spacing w:after="160"/>
+      </w:pPr>
+      <w:r>
+        <w:t xml:space="preserve">There's also an Admin button (top right, blue border) that jumps straight to History and opens Admin Settings from anywhere in the app.</w:t>
       </w:r>
     </w:p>
     <w:p>
@@ -247,7 +254,37 @@
         <w:spacing w:after="160" w:before="320"/>
       </w:pPr>
       <w:r>
-        <w:t xml:space="preserve">2. Logging a New Observation</w:t>
+        <w:t xml:space="preserve">2. The Landing Page</w:t>
+      </w:r>
+    </w:p>
+    <w:p>
+      <w:pPr>
+        <w:spacing w:after="160"/>
+      </w:pPr>
+      <w:r>
+        <w:t xml:space="preserve">Before you sign in, CODA has a public landing page introducing the app — this is what people see if they visit the site without going straight to the app itself.</w:t>
+      </w:r>
+    </w:p>
+    <w:p>
+      <w:pPr>
+        <w:spacing w:after="160"/>
+      </w:pPr>
+      <w:r>
+        <w:t xml:space="preserve">Along the top of the landing page's hero section sits a row of logos: Football Australia at the top, followed by all nine Member Federations. Clicking any Member Federation's logo takes you straight into New Observation with that federation already selected — a shortcut for someone who knows which federation they're logging for.</w:t>
+      </w:r>
+    </w:p>
+    <w:p>
+      <w:r>
+        <w:br w:type="page"/>
+      </w:r>
+    </w:p>
+    <w:p>
+      <w:pPr>
+        <w:pStyle w:val="Heading1"/>
+        <w:spacing w:after="160" w:before="320"/>
+      </w:pPr>
+      <w:r>
+        <w:t xml:space="preserve">3. Logging a New Observation</w:t>
       </w:r>
     </w:p>
     <w:p>
@@ -303,7 +340,7 @@
         <w:spacing w:after="100"/>
       </w:pPr>
       <w:r>
-        <w:t xml:space="preserve">Select the Member Federation this report belongs to — it sets the logo shown on the printed PDF. Defaults to Football Victoria.</w:t>
+        <w:t xml:space="preserve">Select the Member Federation this report belongs to — it sets the logo shown on the printed PDF. Defaults to Football Victoria, or whichever federation you arrived via from the landing page.</w:t>
       </w:r>
     </w:p>
     <w:p>
@@ -372,7 +409,24 @@
           <w:iCs/>
           <w:color w:val="64748B"/>
         </w:rPr>
-        <w:t xml:space="preserve">Fields with a small mic icon in the corner (Session Objective, Key Outcomes Focus, Strengths, Areas for Development, Plan Notes, and General Notes) support voice dictation in supported browsers (Chrome, Edge, Safari) — select the mic and speak instead of typing.</w:t>
+        <w:t xml:space="preserve">If the coach has exactly one Completed Tasks record with a Course Number, CODA auto-fills the course and number for you. If they have more than one, or none, you'll need to select it manually.</w:t>
+      </w:r>
+    </w:p>
+    <w:p>
+      <w:pPr>
+        <w:pStyle w:val="Heading2"/>
+        <w:spacing w:after="120" w:before="240"/>
+      </w:pPr>
+      <w:r>
+        <w:t xml:space="preserve">Step 2 — Session Plan</w:t>
+      </w:r>
+    </w:p>
+    <w:p>
+      <w:pPr>
+        <w:spacing w:after="160"/>
+      </w:pPr>
+      <w:r>
+        <w:t xml:space="preserve">Capture what was actually planned: the Session Topic, Session Objective, number of players, pitch size, rules or constraints, and Type of Session. Then mark the pitch zones used directly on the diagram — tap a zone to select it, or use Full Pitch to select all 18 at once. D3/M3/F3 (Defensive/Middle/Final Third) are calculated automatically from whichever zones you pick.</w:t>
       </w:r>
     </w:p>
     <w:p>
@@ -389,24 +443,7 @@
           <w:iCs/>
           <w:color w:val="64748B"/>
         </w:rPr>
-        <w:t xml:space="preserve">If the coach has exactly one Completed Tasks record with a Course Number, CODA auto-fills the course and number for you. If they have more than one, or none, you'll need to select it manually.</w:t>
-      </w:r>
-    </w:p>
-    <w:p>
-      <w:pPr>
-        <w:pStyle w:val="Heading2"/>
-        <w:spacing w:after="120" w:before="240"/>
-      </w:pPr>
-      <w:r>
-        <w:t xml:space="preserve">Step 2 — Session Plan</w:t>
-      </w:r>
-    </w:p>
-    <w:p>
-      <w:pPr>
-        <w:spacing w:after="160"/>
-      </w:pPr>
-      <w:r>
-        <w:t xml:space="preserve">Capture what was actually planned: the Session Topic, Session Objective, number of players, pitch size, rules or constraints, and Type of Session. Then mark the pitch zones used directly on the diagram — tap a zone to select it, or use Full Pitch to select all 18 at once. D3/M3/F3 (Defensive/Middle/Final Third) are calculated automatically from whichever zones you pick.</w:t>
+        <w:t xml:space="preserve">Typing the Pitch Size fields: after two digits in Length, the cursor jumps automatically to Width (and back again) — no need to tab manually.</w:t>
       </w:r>
     </w:p>
     <w:p>
@@ -482,15 +519,32 @@
         <w:spacing w:after="160"/>
       </w:pPr>
       <w:r>
-        <w:t xml:space="preserve">If the total score reaches 16 or higher, a Potential Future Pathways box appears — tick any pathways worth flagging for that coach (Analyst, High Performance Coach, S&amp;C Coach).</w:t>
-      </w:r>
-    </w:p>
-    <w:p>
-      <w:pPr>
-        <w:spacing w:after="160"/>
-      </w:pPr>
-      <w:r>
-        <w:t xml:space="preserve">Finally, add the Assessor Signature (auto-filled from the CET, editable) and select Save &amp; Submit. The observation moves into History and, if it's linked to a Completed Tasks record by Course Number, that record's checklist updates automatically.</w:t>
+        <w:t xml:space="preserve">If the total score reaches 16 or higher, a Potential Future Pathways box appears automatically — tick any pathways worth flagging for that coach (Analyst, High Performance Coach, S&amp;C Coach).</w:t>
+      </w:r>
+    </w:p>
+    <w:p>
+      <w:pPr>
+        <w:spacing w:after="160"/>
+      </w:pPr>
+      <w:r>
+        <w:t xml:space="preserve">Finally, add the Assessor Signature (auto-filled from the CET, editable) and select Save &amp; Submit.</w:t>
+      </w:r>
+    </w:p>
+    <w:p>
+      <w:pPr>
+        <w:pStyle w:val="Heading2"/>
+        <w:spacing w:after="120" w:before="240"/>
+      </w:pPr>
+      <w:r>
+        <w:t xml:space="preserve">Voice dictation</w:t>
+      </w:r>
+    </w:p>
+    <w:p>
+      <w:pPr>
+        <w:spacing w:after="160"/>
+      </w:pPr>
+      <w:r>
+        <w:t xml:space="preserve">Several text fields — Session Objective, Key Outcomes Focus, Strengths, Areas for Development, Plan Notes, and General Notes — have a small mic icon in the corner. Select it and speak instead of typing, in any browser that supports it (Chrome, Edge, Safari). Moving to another field automatically stops the dictation.</w:t>
       </w:r>
     </w:p>
     <w:p>
@@ -504,7 +558,7 @@
         <w:spacing w:after="160" w:before="320"/>
       </w:pPr>
       <w:r>
-        <w:t xml:space="preserve">3. Completed Tasks</w:t>
+        <w:t xml:space="preserve">4. Completed Tasks</w:t>
       </w:r>
     </w:p>
     <w:p>
@@ -547,58 +601,6 @@
       </w:pPr>
       <w:r>
         <w:t xml:space="preserve">Select Import Coursework CSV, choose B Diploma or C Diploma, enter the Course Title and Course Number (required), then upload your roster. This directly accepts an export from Football Australia's registration system — CODA combines separate First Name/Last Name columns automatically, reads Suborganisation as Club and Username as FA Number, and detects attendance columns automatically from headers like "12/07/2026 (3)". Coaches are matched by name against your existing roster — anyone not already on file is added automatically. A blank template matching this exact format is available from Logistics → Course Candidate Sheet Template.</w:t>
-      </w:r>
-    </w:p>
-    <w:p>
-      <w:pPr>
-        <w:pStyle w:val="ListParagraph"/>
-        <w:numPr>
-          <w:ilvl w:val="0"/>
-          <w:numId w:val="4"/>
-        </w:numPr>
-        <w:spacing w:after="100"/>
-      </w:pPr>
-      <w:r>
-        <w:t xml:space="preserve">Choose the diploma type.</w:t>
-      </w:r>
-    </w:p>
-    <w:p>
-      <w:pPr>
-        <w:pStyle w:val="ListParagraph"/>
-        <w:numPr>
-          <w:ilvl w:val="0"/>
-          <w:numId w:val="4"/>
-        </w:numPr>
-        <w:spacing w:after="100"/>
-      </w:pPr>
-      <w:r>
-        <w:t xml:space="preserve">Enter the Course Title and Course Number.</w:t>
-      </w:r>
-    </w:p>
-    <w:p>
-      <w:pPr>
-        <w:pStyle w:val="ListParagraph"/>
-        <w:numPr>
-          <w:ilvl w:val="0"/>
-          <w:numId w:val="4"/>
-        </w:numPr>
-        <w:spacing w:after="100"/>
-      </w:pPr>
-      <w:r>
-        <w:t xml:space="preserve">Upload the CSV and confirm which column holds the coach's name (and optionally club, FA number, CET, and session topics).</w:t>
-      </w:r>
-    </w:p>
-    <w:p>
-      <w:pPr>
-        <w:pStyle w:val="ListParagraph"/>
-        <w:numPr>
-          <w:ilvl w:val="0"/>
-          <w:numId w:val="4"/>
-        </w:numPr>
-        <w:spacing w:after="100"/>
-      </w:pPr>
-      <w:r>
-        <w:t xml:space="preserve">Select Generate Preview, check the matches, then Import.</w:t>
       </w:r>
     </w:p>
     <w:p>
@@ -615,7 +617,7 @@
           <w:iCs/>
           <w:color w:val="64748B"/>
         </w:rPr>
-        <w:t xml:space="preserve">If you've already got Completed Tasks records with no Course Number attached (from before this was required), select the affected records under the "No Course Number" group and use Set Course Number for Selected to fix them in one go.</w:t>
+        <w:t xml:space="preserve">This import is not admin-restricted — anyone using CODA can run it, the same as adding a record by hand.</w:t>
       </w:r>
     </w:p>
     <w:p>
@@ -633,6 +635,23 @@
       </w:pPr>
       <w:r>
         <w:t xml:space="preserve">Expand any coach's card to see their full coursework checklist — session plans by topic (B Diploma) or the practical session (C Diploma), plus the fixed milestone items. Items completed via a submitted observation link straight through to that report.</w:t>
+      </w:r>
+    </w:p>
+    <w:p>
+      <w:pPr>
+        <w:pStyle w:val="Heading2"/>
+        <w:spacing w:after="120" w:before="240"/>
+      </w:pPr>
+      <w:r>
+        <w:t xml:space="preserve">Duplicate records</w:t>
+      </w:r>
+    </w:p>
+    <w:p>
+      <w:pPr>
+        <w:spacing w:after="160"/>
+      </w:pPr>
+      <w:r>
+        <w:t xml:space="preserve">If the same coach and course show up as two separate Completed Tasks records — usually from importing the same roster twice — a "Duplicate Records" button appears above the list. Merging takes the higher attendance/online modules percentage and combines every completed checklist item across both, rather than keeping one and losing the other's progress. This is a Master Admin only action.</w:t>
       </w:r>
     </w:p>
     <w:p>
@@ -646,15 +665,15 @@
         <w:spacing w:after="160" w:before="320"/>
       </w:pPr>
       <w:r>
-        <w:t xml:space="preserve">4. Logistics</w:t>
-      </w:r>
-    </w:p>
-    <w:p>
-      <w:pPr>
-        <w:spacing w:after="160"/>
-      </w:pPr>
-      <w:r>
-        <w:t xml:space="preserve">Your roster, tutor list, and course library all live here.</w:t>
+        <w:t xml:space="preserve">5. Logistics</w:t>
+      </w:r>
+    </w:p>
+    <w:p>
+      <w:pPr>
+        <w:spacing w:after="160"/>
+      </w:pPr>
+      <w:r>
+        <w:t xml:space="preserve">Your roster, tutor list, and course library all live here. "How to Use CODA" and "Course Candidate Sheet Template" are downloadable from the top of this tab.</w:t>
       </w:r>
     </w:p>
     <w:p>
@@ -671,7 +690,24 @@
         <w:spacing w:after="160"/>
       </w:pPr>
       <w:r>
-        <w:t xml:space="preserve">Search or browse the full list of coaches and CETs. Each coach can have Session Topics (used in New Observation's topic dropdown), an FA Number, and an IDP (Individual Development Plan) attached — including a .docx upload that gets read into the record automatically.</w:t>
+        <w:t xml:space="preserve">Search or browse the full list of coaches and CETs — no need to type a search term first, the whole list shows by default. Each coach can have Session Topics (used in New Observation's topic dropdown), an FA Number, and an IDP (Individual Development Plan) attached — including a .docx upload that gets read into the record automatically.</w:t>
+      </w:r>
+    </w:p>
+    <w:p>
+      <w:pPr>
+        <w:pStyle w:val="Heading2"/>
+        <w:spacing w:after="120" w:before="240"/>
+      </w:pPr>
+      <w:r>
+        <w:t xml:space="preserve">CET → Member Federation assignment</w:t>
+      </w:r>
+    </w:p>
+    <w:p>
+      <w:pPr>
+        <w:spacing w:after="160"/>
+      </w:pPr>
+      <w:r>
+        <w:t xml:space="preserve">Each CET can be tagged with one or more Member Federations, which determines what a Federation Admin (see Section 7) can see and act on. Assign it individually via the "MF" button on a CET's card, or in bulk: tick the checkboxes on multiple CETs, then use the bar that appears to add or replace their federation assignment all at once.</w:t>
       </w:r>
     </w:p>
     <w:p>
@@ -697,6 +733,40 @@
         <w:spacing w:after="120" w:before="240"/>
       </w:pPr>
       <w:r>
+        <w:t xml:space="preserve">Duplicate coaches and CETs</w:t>
+      </w:r>
+    </w:p>
+    <w:p>
+      <w:pPr>
+        <w:spacing w:after="160"/>
+      </w:pPr>
+      <w:r>
+        <w:t xml:space="preserve">If the same person ends up as two separate profiles — usually from importing data twice under different IDs — a "Duplicates Found" button appears next to Add Coach or Add CET. Merging keeps one profile, moves every observation and completed task onto it, and combines whatever details each duplicate had.</w:t>
+      </w:r>
+    </w:p>
+    <w:p>
+      <w:pPr>
+        <w:pBdr>
+          <w:left w:val="single" w:color="C9A227" w:sz="12" w:space="8"/>
+        </w:pBdr>
+        <w:spacing w:after="200" w:before="60"/>
+        <w:ind w:left="360"/>
+      </w:pPr>
+      <w:r>
+        <w:rPr>
+          <w:i/>
+          <w:iCs/>
+          <w:color w:val="64748B"/>
+        </w:rPr>
+        <w:t xml:space="preserve">Merging duplicate coach profiles is Master Admin only, since coach profiles aren't tagged to a Member Federation. Merging duplicate CETs is available to a Federation Admin too, scoped to their own federation.</w:t>
+      </w:r>
+    </w:p>
+    <w:p>
+      <w:pPr>
+        <w:pStyle w:val="Heading2"/>
+        <w:spacing w:after="120" w:before="240"/>
+      </w:pPr>
+      <w:r>
         <w:t xml:space="preserve">Bulk actions</w:t>
       </w:r>
     </w:p>
@@ -705,7 +775,7 @@
         <w:spacing w:after="160"/>
       </w:pPr>
       <w:r>
-        <w:t xml:space="preserve">Bulk upload coaches or CETs via CSV, or use Remove All Coaches &amp; CETs (Admin PIN required) to wipe the roster clean — past observations stay in History but lose their coach-profile link.</w:t>
+        <w:t xml:space="preserve">Bulk upload coaches or CETs via CSV. "Remove All Coaches" and "Remove All CETs" are separate, independent actions (not combined) — each requires admin sign-in. Removing coaches is Master Admin only; removing CETs can be scoped to a Federation Admin's own federation.</w:t>
       </w:r>
     </w:p>
     <w:p>
@@ -719,15 +789,15 @@
         <w:spacing w:after="160" w:before="320"/>
       </w:pPr>
       <w:r>
-        <w:t xml:space="preserve">5. History</w:t>
-      </w:r>
-    </w:p>
-    <w:p>
-      <w:pPr>
-        <w:spacing w:after="160"/>
-      </w:pPr>
-      <w:r>
-        <w:t xml:space="preserve">Every submitted observation, filterable by coach or CET.</w:t>
+        <w:t xml:space="preserve">6. History</w:t>
+      </w:r>
+    </w:p>
+    <w:p>
+      <w:pPr>
+        <w:spacing w:after="160"/>
+      </w:pPr>
+      <w:r>
+        <w:t xml:space="preserve">Every submitted observation, with a full set of filters: coach, CET, course number, course type (C/B/A Diploma, Foundation, Workshop, Informal), date range, competence outcome, and score range. Select Clear filters to reset them all at once.</w:t>
       </w:r>
     </w:p>
     <w:p>
@@ -744,7 +814,7 @@
         <w:spacing w:after="160"/>
       </w:pPr>
       <w:r>
-        <w:t xml:space="preserve">Select any entry to open the full report — session details, scoring, strengths, development plan, and signature. Select Download PDF at the top to generate a print-ready, A4-formatted copy styled to match the on-screen report, including the Member Federation logo and pitch diagram.</w:t>
+        <w:t xml:space="preserve">Select any entry to open the full report — session details, scoring, strengths, development plan, and signature. Select Download PDF at the top to generate a print-ready, A4-formatted copy styled to match the on-screen report, including the Member Federation logo, session plan detail, and pitch diagram — laid out in the same order as the live form.</w:t>
       </w:r>
     </w:p>
     <w:p>
@@ -762,114 +832,6 @@
       </w:pPr>
       <w:r>
         <w:t xml:space="preserve">Once submitted, a report is locked. An Admin can select Reopen for Editing and enter their name and PIN to make corrections — the report goes back into the draft editor and needs Save &amp; Submit again to return to History.</w:t>
-      </w:r>
-    </w:p>
-    <w:p>
-      <w:pPr>
-        <w:pStyle w:val="Heading2"/>
-        <w:spacing w:after="120" w:before="240"/>
-      </w:pPr>
-      <w:r>
-        <w:t xml:space="preserve">Admin Settings</w:t>
-      </w:r>
-    </w:p>
-    <w:p>
-      <w:pPr>
-        <w:spacing w:after="160"/>
-      </w:pPr>
-      <w:r>
-        <w:t xml:space="preserve">Enter an admin name and PIN to unlock:</w:t>
-      </w:r>
-    </w:p>
-    <w:p>
-      <w:pPr>
-        <w:pStyle w:val="ListParagraph"/>
-        <w:numPr>
-          <w:ilvl w:val="0"/>
-          <w:numId w:val="2"/>
-        </w:numPr>
-        <w:spacing w:after="80"/>
-      </w:pPr>
-      <w:r>
-        <w:t xml:space="preserve">Export Data / Import Data — a full JSON backup of the database, or a way to restore from one.</w:t>
-      </w:r>
-    </w:p>
-    <w:p>
-      <w:pPr>
-        <w:pStyle w:val="ListParagraph"/>
-        <w:numPr>
-          <w:ilvl w:val="0"/>
-          <w:numId w:val="2"/>
-        </w:numPr>
-        <w:spacing w:after="80"/>
-      </w:pPr>
-      <w:r>
-        <w:t xml:space="preserve">Export PDF — every submitted observation plus a Completed Tasks summary, as one downloadable file.</w:t>
-      </w:r>
-    </w:p>
-    <w:p>
-      <w:pPr>
-        <w:pStyle w:val="ListParagraph"/>
-        <w:numPr>
-          <w:ilvl w:val="0"/>
-          <w:numId w:val="2"/>
-        </w:numPr>
-        <w:spacing w:after="80"/>
-      </w:pPr>
-      <w:r>
-        <w:t xml:space="preserve">Clear History — permanently deletes every observation. Cannot be undone.</w:t>
-      </w:r>
-    </w:p>
-    <w:p>
-      <w:pPr>
-        <w:pStyle w:val="ListParagraph"/>
-        <w:numPr>
-          <w:ilvl w:val="0"/>
-          <w:numId w:val="2"/>
-        </w:numPr>
-        <w:spacing w:after="80"/>
-      </w:pPr>
-      <w:r>
-        <w:t xml:space="preserve">Admins — add up to the configured limit of admins, each with their own PIN.</w:t>
-      </w:r>
-    </w:p>
-    <w:p>
-      <w:pPr>
-        <w:pStyle w:val="ListParagraph"/>
-        <w:numPr>
-          <w:ilvl w:val="0"/>
-          <w:numId w:val="2"/>
-        </w:numPr>
-        <w:spacing w:after="80"/>
-      </w:pPr>
-      <w:r>
-        <w:t xml:space="preserve">Change Your PIN — updates only the signed-in admin's own PIN.</w:t>
-      </w:r>
-    </w:p>
-    <w:p>
-      <w:pPr>
-        <w:pStyle w:val="ListParagraph"/>
-        <w:numPr>
-          <w:ilvl w:val="0"/>
-          <w:numId w:val="2"/>
-        </w:numPr>
-        <w:spacing w:after="80"/>
-      </w:pPr>
-      <w:r>
-        <w:t xml:space="preserve">Lead Admin — the Lead Admin's session locks out every other admin from Admin Settings while they're in it; only the current Lead Admin can hand the role to someone else.</w:t>
-      </w:r>
-    </w:p>
-    <w:p>
-      <w:pPr>
-        <w:pStyle w:val="ListParagraph"/>
-        <w:numPr>
-          <w:ilvl w:val="0"/>
-          <w:numId w:val="2"/>
-        </w:numPr>
-        <w:spacing w:after="80"/>
-      </w:pPr>
-      <w:r>
-        <w:t xml:space="preserve">Admin Slots and Full PIN Reset — available to Admin 1 only.</w:t>
       </w:r>
     </w:p>
     <w:p>
@@ -883,7 +845,183 @@
         <w:spacing w:after="160" w:before="320"/>
       </w:pPr>
       <w:r>
-        <w:t xml:space="preserve">6. Tips &amp; Troubleshooting</w:t>
+        <w:t xml:space="preserve">7. Admin Settings — Master vs Federation Admin</w:t>
+      </w:r>
+    </w:p>
+    <w:p>
+      <w:pPr>
+        <w:spacing w:after="160"/>
+      </w:pPr>
+      <w:r>
+        <w:t xml:space="preserve">Select the Admin button (top right, blue border, visible on every tab) to sign in. There are two kinds of admin:</w:t>
+      </w:r>
+    </w:p>
+    <w:p>
+      <w:pPr>
+        <w:pStyle w:val="Heading2"/>
+        <w:spacing w:after="120" w:before="240"/>
+      </w:pPr>
+      <w:r>
+        <w:t xml:space="preserve">Master Admin</w:t>
+      </w:r>
+    </w:p>
+    <w:p>
+      <w:pPr>
+        <w:spacing w:after="160"/>
+      </w:pPr>
+      <w:r>
+        <w:t xml:space="preserve">Full, unrestricted control — every action described below, across every Member Federation. Your existing admins were all set up as Master when this system was introduced.</w:t>
+      </w:r>
+    </w:p>
+    <w:p>
+      <w:pPr>
+        <w:pStyle w:val="Heading2"/>
+        <w:spacing w:after="120" w:before="240"/>
+      </w:pPr>
+      <w:r>
+        <w:t xml:space="preserve">Federation Admin</w:t>
+      </w:r>
+    </w:p>
+    <w:p>
+      <w:pPr>
+        <w:spacing w:after="160"/>
+      </w:pPr>
+      <w:r>
+        <w:t xml:space="preserve">Scoped to one or more Member Federations, assigned when the admin is added. A Federation Admin can:</w:t>
+      </w:r>
+    </w:p>
+    <w:p>
+      <w:pPr>
+        <w:pStyle w:val="ListParagraph"/>
+        <w:numPr>
+          <w:ilvl w:val="0"/>
+          <w:numId w:val="2"/>
+        </w:numPr>
+        <w:spacing w:after="80"/>
+      </w:pPr>
+      <w:r>
+        <w:t xml:space="preserve">Clear History — but only observations tagged to their own federation(s); everyone else's history is untouched.</w:t>
+      </w:r>
+    </w:p>
+    <w:p>
+      <w:pPr>
+        <w:pStyle w:val="ListParagraph"/>
+        <w:numPr>
+          <w:ilvl w:val="0"/>
+          <w:numId w:val="2"/>
+        </w:numPr>
+        <w:spacing w:after="80"/>
+      </w:pPr>
+      <w:r>
+        <w:t xml:space="preserve">Remove All CETs — but only CETs tagged to their own federation(s).</w:t>
+      </w:r>
+    </w:p>
+    <w:p>
+      <w:pPr>
+        <w:pStyle w:val="ListParagraph"/>
+        <w:numPr>
+          <w:ilvl w:val="0"/>
+          <w:numId w:val="2"/>
+        </w:numPr>
+        <w:spacing w:after="80"/>
+      </w:pPr>
+      <w:r>
+        <w:t xml:space="preserve">Reopen Report — but only for reports belonging to their own federation.</w:t>
+      </w:r>
+    </w:p>
+    <w:p>
+      <w:pPr>
+        <w:pStyle w:val="ListParagraph"/>
+        <w:numPr>
+          <w:ilvl w:val="0"/>
+          <w:numId w:val="2"/>
+        </w:numPr>
+        <w:spacing w:after="80"/>
+      </w:pPr>
+      <w:r>
+        <w:t xml:space="preserve">Merge Duplicate CETs — but only groups where at least one profile is tagged to their own federation.</w:t>
+      </w:r>
+    </w:p>
+    <w:p>
+      <w:pPr>
+        <w:pStyle w:val="ListParagraph"/>
+        <w:numPr>
+          <w:ilvl w:val="0"/>
+          <w:numId w:val="2"/>
+        </w:numPr>
+        <w:spacing w:after="80"/>
+      </w:pPr>
+      <w:r>
+        <w:t xml:space="preserve">Export PDF — but only their own federation's submitted observations (plus a best-effort match on related Completed Tasks, since those aren't federation-tagged directly).</w:t>
+      </w:r>
+    </w:p>
+    <w:p>
+      <w:pPr>
+        <w:pStyle w:val="ListParagraph"/>
+        <w:numPr>
+          <w:ilvl w:val="0"/>
+          <w:numId w:val="2"/>
+        </w:numPr>
+        <w:spacing w:after="80"/>
+      </w:pPr>
+      <w:r>
+        <w:t xml:space="preserve">Change their own PIN.</w:t>
+      </w:r>
+    </w:p>
+    <w:p>
+      <w:pPr>
+        <w:spacing w:after="160"/>
+      </w:pPr>
+      <w:r>
+        <w:t xml:space="preserve">Master Admin only, always: adding or managing other admins, Lead Admin controls, Export Data / Import Data (the full JSON backup/restore tool), Admin Slots, Full PIN Reset, Remove All Coaches, and Merge Duplicate Coaches — coach profiles aren't tagged to a federation, so these can't be safely scoped.</w:t>
+      </w:r>
+    </w:p>
+    <w:p>
+      <w:pPr>
+        <w:pBdr>
+          <w:left w:val="single" w:color="C9A227" w:sz="12" w:space="8"/>
+        </w:pBdr>
+        <w:spacing w:after="200" w:before="60"/>
+        <w:ind w:left="360"/>
+      </w:pPr>
+      <w:r>
+        <w:rPr>
+          <w:i/>
+          <w:iCs/>
+          <w:color w:val="64748B"/>
+        </w:rPr>
+        <w:t xml:space="preserve">Federation Admins don't lock each other out the way Master Admins do under Lead Admin — they can work independently and concurrently, since they're typically working on different federations' data.</w:t>
+      </w:r>
+    </w:p>
+    <w:p>
+      <w:pPr>
+        <w:pStyle w:val="Heading2"/>
+        <w:spacing w:after="120" w:before="240"/>
+      </w:pPr>
+      <w:r>
+        <w:t xml:space="preserve">Adding an admin</w:t>
+      </w:r>
+    </w:p>
+    <w:p>
+      <w:pPr>
+        <w:spacing w:after="160"/>
+      </w:pPr>
+      <w:r>
+        <w:t xml:space="preserve">Only a Master Admin can add new admins. Choose Master Admin or Federation Admin (with one or more federations selected), then either set their PIN yourself or hand them the device to set it privately.</w:t>
+      </w:r>
+    </w:p>
+    <w:p>
+      <w:r>
+        <w:br w:type="page"/>
+      </w:r>
+    </w:p>
+    <w:p>
+      <w:pPr>
+        <w:pStyle w:val="Heading1"/>
+        <w:spacing w:after="160" w:before="320"/>
+      </w:pPr>
+      <w:r>
+        <w:t xml:space="preserve">8. Tips &amp; Troubleshooting</w:t>
       </w:r>
     </w:p>
     <w:p>
@@ -922,20 +1060,7 @@
         <w:spacing w:after="80"/>
       </w:pPr>
       <w:r>
-        <w:t xml:space="preserve">The Potential Future Pathways box is based on the actual score reaching 16+, not on whatever the Assessment Outcome dropdown currently shows.</w:t>
-      </w:r>
-    </w:p>
-    <w:p>
-      <w:pPr>
-        <w:pStyle w:val="ListParagraph"/>
-        <w:numPr>
-          <w:ilvl w:val="0"/>
-          <w:numId w:val="2"/>
-        </w:numPr>
-        <w:spacing w:after="80"/>
-      </w:pPr>
-      <w:r>
-        <w:t xml:space="preserve">If you can't find a coach or CET in Logistics, the list now shows everyone by default — no need to search first.</w:t>
+        <w:t xml:space="preserve">The Potential Future Pathways box is based on the actual running score reaching 16+, not on whatever the Assessment Outcome dropdown currently shows.</w:t>
       </w:r>
     </w:p>
     <w:p>
@@ -949,6 +1074,32 @@
       </w:pPr>
       <w:r>
         <w:t xml:space="preserve">Session Topic and Diploma Block are required for B and C Diploma courses specifically, so the wizard won't let you submit without them for those course types.</w:t>
+      </w:r>
+    </w:p>
+    <w:p>
+      <w:pPr>
+        <w:pStyle w:val="ListParagraph"/>
+        <w:numPr>
+          <w:ilvl w:val="0"/>
+          <w:numId w:val="2"/>
+        </w:numPr>
+        <w:spacing w:after="80"/>
+      </w:pPr>
+      <w:r>
+        <w:t xml:space="preserve">The pitch zones diagram shows one consistent shade per column, not two — if you're comparing to an older screenshot, this is intentional.</w:t>
+      </w:r>
+    </w:p>
+    <w:p>
+      <w:pPr>
+        <w:pStyle w:val="ListParagraph"/>
+        <w:numPr>
+          <w:ilvl w:val="0"/>
+          <w:numId w:val="2"/>
+        </w:numPr>
+        <w:spacing w:after="80"/>
+      </w:pPr>
+      <w:r>
+        <w:t xml:space="preserve">If a duplicate coach, CET, or Completed Tasks record isn't picked up automatically, it's because the names don't match exactly (a missing middle name, a typo) — the detection only catches exact matches.</w:t>
       </w:r>
     </w:p>
     <w:p>
@@ -1179,18 +1330,6 @@
       </w:pPr>
     </w:lvl>
   </w:abstractNum>
-  <w:abstractNum w:abstractNumId="4" w15:restartNumberingAfterBreak="0">
-    <w:multiLevelType w:val="hybridMultilevel"/>
-    <w:lvl w:ilvl="0" w15:tentative="1">
-      <w:start w:val="1"/>
-      <w:numFmt w:val="decimal"/>
-      <w:lvlText w:val="%1."/>
-      <w:lvlJc w:val="left"/>
-      <w:pPr>
-        <w:ind w:left="720" w:hanging="360"/>
-      </w:pPr>
-    </w:lvl>
-  </w:abstractNum>
   <w:num w:numId="1">
     <w:abstractNumId w:val="1"/>
     <w:lvlOverride w:ilvl="0">
@@ -1205,12 +1344,6 @@
   </w:num>
   <w:num w:numId="3">
     <w:abstractNumId w:val="3"/>
-    <w:lvlOverride w:ilvl="0">
-      <w:startOverride w:val="1"/>
-    </w:lvlOverride>
-  </w:num>
-  <w:num w:numId="4">
-    <w:abstractNumId w:val="4"/>
     <w:lvlOverride w:ilvl="0">
       <w:startOverride w:val="1"/>
     </w:lvlOverride>

</xml_diff>

<commit_message>
Add MF/course visibility filtering; update How to Use CODA doc
</commit_message>
<xml_diff>
--- a/public/CODA_How_To_Use.docx
+++ b/public/CODA_How_To_Use.docx
@@ -119,7 +119,7 @@
         <w:spacing w:after="160"/>
       </w:pPr>
       <w:r>
-        <w:t xml:space="preserve">8. Admin Settings — Master, Lead, and Course Admin</w:t>
+        <w:t xml:space="preserve">8. Admin Settings — MA Admin, MF Admin, MF Coordinator, and Course Admin</w:t>
       </w:r>
     </w:p>
     <w:p>
@@ -157,7 +157,15 @@
         <w:spacing w:after="160"/>
       </w:pPr>
       <w:r>
-        <w:t xml:space="preserve">CODA is a shared workspace — everyone using it sees the same coaches, courses, and observation history. There's no password to get in; the first time you open CODA on a device, you're asked for your FA Number just to identify who you are. It's remembered on that device from then on.</w:t>
+        <w:t xml:space="preserve">CODA is a shared workspace — everyone using it sees the same coaches, courses, and observation history, though what shows up in the Dashboard, Completed Tasks, and History can be scoped down depending on how you sign in (more below).</w:t>
+      </w:r>
+    </w:p>
+    <w:p>
+      <w:pPr>
+        <w:spacing w:after="160"/>
+      </w:pPr>
+      <w:r>
+        <w:t xml:space="preserve">The first time you open CODA on a device (or any time after using Sign Out), you're asked to identify yourself: as a CET — just pick your name from the list, no PIN needed — or as an Admin, with a name and 4-digit PIN. Your choice is remembered on that device until you sign out, using the link next to your name in the top-right of the header.</w:t>
       </w:r>
     </w:p>
     <w:p>
@@ -174,7 +182,7 @@
           <w:iCs/>
           <w:color w:val="64748B"/>
         </w:rPr>
-        <w:t xml:space="preserve">This is identification, not security — it doesn't restrict what you can see or do. Admin-only actions have their own separate PIN, covered in Section 8.</w:t>
+        <w:t xml:space="preserve">Signing in as a CET doesn't restrict anything — you get full access to do your normal work. Signing in as an Admin does: MA Admin sees every federation's courses and activity, MF Admin and MF Coordinator only see their own federation's, and Course Admin only sees their assigned course(s). Full detail on the four admin tiers is in Section 8.</w:t>
       </w:r>
     </w:p>
     <w:p>
@@ -863,49 +871,57 @@
         <w:spacing w:after="160" w:before="320"/>
       </w:pPr>
       <w:r>
-        <w:t xml:space="preserve">8. Admin Settings — Master, Lead, and Course Admin</w:t>
-      </w:r>
-    </w:p>
-    <w:p>
-      <w:pPr>
-        <w:spacing w:after="160"/>
-      </w:pPr>
-      <w:r>
-        <w:t xml:space="preserve">The Admin button opens sign-in. There are three tiers:</w:t>
-      </w:r>
-    </w:p>
-    <w:p>
-      <w:pPr>
-        <w:pStyle w:val="Heading2"/>
-        <w:spacing w:after="120" w:before="240"/>
-      </w:pPr>
-      <w:r>
-        <w:t xml:space="preserve">Master Admin</w:t>
-      </w:r>
-    </w:p>
-    <w:p>
-      <w:pPr>
-        <w:spacing w:after="160"/>
-      </w:pPr>
-      <w:r>
-        <w:t xml:space="preserve">Full, unrestricted control across every Member Federation. There's exactly one — you.</w:t>
-      </w:r>
-    </w:p>
-    <w:p>
-      <w:pPr>
-        <w:pStyle w:val="Heading2"/>
-        <w:spacing w:after="120" w:before="240"/>
-      </w:pPr>
-      <w:r>
-        <w:t xml:space="preserve">Lead Admin</w:t>
-      </w:r>
-    </w:p>
-    <w:p>
-      <w:pPr>
-        <w:spacing w:after="160"/>
-      </w:pPr>
-      <w:r>
-        <w:t xml:space="preserve">One per Member Federation (up to 10 total, including Football Australia) — the MF's Technical Director or Coach Education Manager. Each federation can only have one Lead Admin at a time; the picker shows already-claimed federations as taken. A Lead Admin can:</w:t>
+        <w:t xml:space="preserve">8. Admin Settings — MA Admin, MF Admin, MF Coordinator, and Course Admin</w:t>
+      </w:r>
+    </w:p>
+    <w:p>
+      <w:pPr>
+        <w:spacing w:after="160"/>
+      </w:pPr>
+      <w:r>
+        <w:t xml:space="preserve">This Admin Settings panel is separate from the sign-in screen you see when opening CODA (Section 1) — even if you already signed in as an admin there, opening Admin Settings from the Admin button asks for your name and PIN again.</w:t>
+      </w:r>
+    </w:p>
+    <w:p>
+      <w:pPr>
+        <w:spacing w:after="160"/>
+      </w:pPr>
+      <w:r>
+        <w:t xml:space="preserve">The Admin button opens sign-in. There are four tiers:</w:t>
+      </w:r>
+    </w:p>
+    <w:p>
+      <w:pPr>
+        <w:pStyle w:val="Heading2"/>
+        <w:spacing w:after="120" w:before="240"/>
+      </w:pPr>
+      <w:r>
+        <w:t xml:space="preserve">MA Admin</w:t>
+      </w:r>
+    </w:p>
+    <w:p>
+      <w:pPr>
+        <w:spacing w:after="160"/>
+      </w:pPr>
+      <w:r>
+        <w:t xml:space="preserve">Full, unrestricted control across every Member Federation. There's exactly one — you. Sees every course and every federation's activity, everywhere in the app.</w:t>
+      </w:r>
+    </w:p>
+    <w:p>
+      <w:pPr>
+        <w:pStyle w:val="Heading2"/>
+        <w:spacing w:after="120" w:before="240"/>
+      </w:pPr>
+      <w:r>
+        <w:t xml:space="preserve">MF Admin</w:t>
+      </w:r>
+    </w:p>
+    <w:p>
+      <w:pPr>
+        <w:spacing w:after="160"/>
+      </w:pPr>
+      <w:r>
+        <w:t xml:space="preserve">One per Member Federation (up to 10 total, including Football Australia) — the MF's Technical Director or Coach Education Manager. Each federation can only have one MF Admin at a time; the picker shows already-claimed federations as taken. Once signed in, the Dashboard, Completed Tasks, and History only show their own federation's courses and activity. An MF Admin can:</w:t>
       </w:r>
     </w:p>
     <w:p>
@@ -931,7 +947,7 @@
         <w:spacing w:after="80"/>
       </w:pPr>
       <w:r>
-        <w:t xml:space="preserve">Add Course Admins for their own federation (up to 4).</w:t>
+        <w:t xml:space="preserve">Add Course Admins and one MF Coordinator for their own federation.</w:t>
       </w:r>
     </w:p>
     <w:p>
@@ -953,6 +969,70 @@
         <w:spacing w:after="120" w:before="240"/>
       </w:pPr>
       <w:r>
+        <w:t xml:space="preserve">MF Coordinator</w:t>
+      </w:r>
+    </w:p>
+    <w:p>
+      <w:pPr>
+        <w:spacing w:after="160"/>
+      </w:pPr>
+      <w:r>
+        <w:t xml:space="preserve">One per Member Federation, addable by Master or that federation's own MF Admin. A lighter version of MF Admin — the same MF-scoped view of courses and activity, and the same day-to-day management, but without MF Admin's bulk-destructive powers. An MF Coordinator can:</w:t>
+      </w:r>
+    </w:p>
+    <w:p>
+      <w:pPr>
+        <w:pStyle w:val="ListParagraph"/>
+        <w:numPr>
+          <w:ilvl w:val="0"/>
+          <w:numId w:val="2"/>
+        </w:numPr>
+        <w:spacing w:after="80"/>
+      </w:pPr>
+      <w:r>
+        <w:t xml:space="preserve">Reopen Report, export PDFs, set Progress Tracking status, and manage RAPA assessors — all scoped to their own federation.</w:t>
+      </w:r>
+    </w:p>
+    <w:p>
+      <w:pPr>
+        <w:pStyle w:val="ListParagraph"/>
+        <w:numPr>
+          <w:ilvl w:val="0"/>
+          <w:numId w:val="2"/>
+        </w:numPr>
+        <w:spacing w:after="80"/>
+      </w:pPr>
+      <w:r>
+        <w:t xml:space="preserve">Access the Bin, scoped to their own federation.</w:t>
+      </w:r>
+    </w:p>
+    <w:p>
+      <w:pPr>
+        <w:pStyle w:val="ListParagraph"/>
+        <w:numPr>
+          <w:ilvl w:val="0"/>
+          <w:numId w:val="2"/>
+        </w:numPr>
+        <w:spacing w:after="80"/>
+      </w:pPr>
+      <w:r>
+        <w:t xml:space="preserve">Change their own PIN.</w:t>
+      </w:r>
+    </w:p>
+    <w:p>
+      <w:pPr>
+        <w:spacing w:after="160"/>
+      </w:pPr>
+      <w:r>
+        <w:t xml:space="preserve">An MF Coordinator cannot Clear History, Remove All CETs, Merge Duplicate CETs, or add and remove other admins.</w:t>
+      </w:r>
+    </w:p>
+    <w:p>
+      <w:pPr>
+        <w:pStyle w:val="Heading2"/>
+        <w:spacing w:after="120" w:before="240"/>
+      </w:pPr>
+      <w:r>
         <w:t xml:space="preserve">Course Admin</w:t>
       </w:r>
     </w:p>
@@ -961,7 +1041,7 @@
         <w:spacing w:after="160"/>
       </w:pPr>
       <w:r>
-        <w:t xml:space="preserve">Up to 4 per Member Federation, appointed by Master or that federation's Lead Admin — scoped to specific course numbers, not the whole federation. A Course Admin can:</w:t>
+        <w:t xml:space="preserve">Up to 4 per Member Federation, appointed by Master or that federation's MF Admin — scoped to specific course numbers, not the whole federation. Once signed in, the Dashboard, Completed Tasks, and History only show their assigned course(s). A Course Admin can:</w:t>
       </w:r>
     </w:p>
     <w:p>
@@ -1016,7 +1096,7 @@
         <w:spacing w:after="160"/>
       </w:pPr>
       <w:r>
-        <w:t xml:space="preserve">Master Admin only, always: adding or managing admins beyond what's described above, Session Host controls, Export Data / Import Data, Admin Slots, Full PIN Reset, Remove All Coaches, and Merge Duplicate Coaches.</w:t>
+        <w:t xml:space="preserve">MA Admin only, always: adding or managing admins beyond what's described above, Session Host controls, Export Data / Import Data, Admin Slots, Full PIN Reset, Remove All Coaches, and Merge Duplicate Coaches.</w:t>
       </w:r>
     </w:p>
     <w:p>
@@ -1033,7 +1113,7 @@
         <w:spacing w:after="160"/>
       </w:pPr>
       <w:r>
-        <w:t xml:space="preserve">Add Admin: Master can add any tier; a Lead Admin can only add Course Admins for their own federation. Each admin badge in the list shows Edit PIN (Master only, changes just that person's PIN) and Remove (Master for anyone; a Lead Admin for their own Course Admins). Removing the last remaining Master Admin is blocked.</w:t>
+        <w:t xml:space="preserve">Add Admin: MA Admin can add any tier; an MF Admin can add Course Admins and one MF Coordinator for their own federation. Each admin badge in the list shows Edit PIN (MA Admin only, changes just that person's PIN) and Remove (MA Admin for anyone; an MF Admin for their own Course Admins and MF Coordinator). Removing the last remaining MA Admin is blocked.</w:t>
       </w:r>
     </w:p>
     <w:p>
@@ -1067,7 +1147,7 @@
         <w:spacing w:after="160"/>
       </w:pPr>
       <w:r>
-        <w:t xml:space="preserve">A separate, technical safeguard: only one Master Admin can be in Admin Settings making changes at a time. Whoever is currently "Session Host" locks the settings while they're in there; entering as Session Host signs out anyone else who was already inside. This only applies among Master Admins — Lead and Course Admins work independently and don't trigger or get affected by it.</w:t>
+        <w:t xml:space="preserve">A separate, technical safeguard: only one MA Admin can be in Admin Settings making changes at a time. Whoever is currently “Session Host” locks the settings while they're in there; entering as Session Host signs out anyone else who was already inside. This only applies among MA Admins — MF Admin, MF Coordinator, and Course Admin work independently and don't trigger or get affected by it.</w:t>
       </w:r>
     </w:p>
     <w:p>

</xml_diff>